<commit_message>
modificaciones proceso de nuevo cliente
</commit_message>
<xml_diff>
--- a/assets/procesos/metodologia/guia-documentacion-procesos.docx
+++ b/assets/procesos/metodologia/guia-documentacion-procesos.docx
@@ -24,7 +24,7 @@
           <w:color w:val="595959"/>
           <w:sz w:val="22"/>
         </w:rPr>
-        <w:t>SP Seguridad Privada · Proceso y Mejora Continua · Metodología común para todos los subprocesos y áreas</w:t>
+        <w:t>SP Seguridad Privada · Procesos y Mejora Continua · Metodología común para todos los subprocesos y áreas</w:t>
       </w:r>
     </w:p>
     <w:p>
@@ -2173,7 +2173,7 @@
         <w:rPr>
           <w:b w:val="0"/>
         </w:rPr>
-        <w:t xml:space="preserve"> ingreso con cuenta Google de SP. Todos leen; solo el equipo de Proceso y Mejora Continua edita.</w:t>
+        <w:t xml:space="preserve"> ingreso con cuenta Google de SP. Todos leen; solo el equipo de Procesos y Mejora Continua edita.</w:t>
       </w:r>
     </w:p>
     <w:p>
@@ -2884,6 +2884,7 @@
     </w:p>
     <w:sectPr>
       <w:footerReference w:type="default" r:id="rId9"/>
+      <w:headerReference w:type="default" r:id="rId10"/>
       <w:pgSz w:w="12240" w:h="15840"/>
       <w:pgMar w:top="1134" w:right="1247" w:bottom="1134" w:left="1247" w:header="720" w:footer="720" w:gutter="0"/>
       <w:cols w:space="720"/>
@@ -2910,6 +2911,16 @@
     </w:r>
   </w:p>
 </w:ftr>
+</file>
+
+<file path=word/header1.xml><?xml version="1.0" encoding="utf-8"?>
+<w:hdr xmlns:m="http://schemas.openxmlformats.org/officeDocument/2006/math" xmlns:mc="http://schemas.openxmlformats.org/markup-compatibility/2006" xmlns:mo="http://schemas.microsoft.com/office/mac/office/2008/main" xmlns:mv="urn:schemas-microsoft-com:mac:vml" xmlns:o="urn:schemas-microsoft-com:office:office" xmlns:r="http://schemas.openxmlformats.org/officeDocument/2006/relationships" xmlns:v="urn:schemas-microsoft-com:vml" xmlns:w10="urn:schemas-microsoft-com:office:word" xmlns:w14="http://schemas.microsoft.com/office/word/2010/wordml" xmlns:w="http://schemas.openxmlformats.org/wordprocessingml/2006/main" xmlns:wne="http://schemas.microsoft.com/office/word/2006/wordml" xmlns:wp14="http://schemas.microsoft.com/office/word/2010/wordprocessingDrawing" xmlns:wp="http://schemas.openxmlformats.org/drawingml/2006/wordprocessingDrawing" xmlns:wpc="http://schemas.microsoft.com/office/word/2010/wordprocessingCanvas" xmlns:wpg="http://schemas.microsoft.com/office/word/2010/wordprocessingGroup" xmlns:wpi="http://schemas.microsoft.com/office/word/2010/wordprocessingInk" xmlns:wps="http://schemas.microsoft.com/office/word/2010/wordprocessingShape" mc:Ignorable="w14 wp14">
+  <w:p>
+    <w:pPr>
+      <w:pStyle w:val="Header"/>
+    </w:pPr>
+  </w:p>
+</w:hdr>
 </file>
 
 <file path=word/numbering.xml><?xml version="1.0" encoding="utf-8"?>

</xml_diff>